<commit_message>
modified About me file and added a new file
</commit_message>
<xml_diff>
--- a/About me.docx
+++ b/About me.docx
@@ -9,6 +9,8 @@
       <w:r>
         <w:rPr>
           <w:rStyle w:val="Strong"/>
+          <w:b w:val="0"/>
+          <w:bCs w:val="0"/>
         </w:rPr>
         <w:t>About Me</w:t>
       </w:r>
@@ -23,6 +25,8 @@
       <w:r>
         <w:rPr>
           <w:rStyle w:val="Strong"/>
+          <w:b w:val="0"/>
+          <w:bCs w:val="0"/>
         </w:rPr>
         <w:t>Quality Assurance (QA)</w:t>
       </w:r>
@@ -32,6 +36,8 @@
       <w:r>
         <w:rPr>
           <w:rStyle w:val="Strong"/>
+          <w:b w:val="0"/>
+          <w:bCs w:val="0"/>
         </w:rPr>
         <w:t>Testify Academy</w:t>
       </w:r>
@@ -49,6 +55,8 @@
       <w:r>
         <w:rPr>
           <w:rStyle w:val="Strong"/>
+          <w:b w:val="0"/>
+          <w:bCs w:val="0"/>
         </w:rPr>
         <w:t>analytical thinking, attention to detail, risk assessment, and problem-solving skills</w:t>
       </w:r>
@@ -66,6 +74,8 @@
       <w:r>
         <w:rPr>
           <w:rStyle w:val="Strong"/>
+          <w:b w:val="0"/>
+          <w:bCs w:val="0"/>
         </w:rPr>
         <w:t>manual testing, test documentation, bug reporting, SDLC/STLC understanding, collaboration with cross-functional teams, and basic exposure to automation and API concepts</w:t>
       </w:r>
@@ -75,6 +85,8 @@
       <w:r>
         <w:rPr>
           <w:rStyle w:val="Strong"/>
+          <w:b w:val="0"/>
+          <w:bCs w:val="0"/>
         </w:rPr>
         <w:t>Jira, GitHub, and documentation platforms</w:t>
       </w:r>
@@ -92,6 +104,8 @@
       <w:r>
         <w:rPr>
           <w:rStyle w:val="Strong"/>
+          <w:b w:val="0"/>
+          <w:bCs w:val="0"/>
         </w:rPr>
         <w:t>leadership, communication, and teamwork abilities</w:t>
       </w:r>
@@ -107,7 +121,23 @@
         <w:t>My key achievement is successfully taking a bold career transition from medicine into technology, demonstrating adaptability, discipline, and a strong commitment to continuous learning. I am motivated to contribute to building high-quality digital products while growing into a well-rounded QA professional.</w:t>
       </w:r>
     </w:p>
-    <w:p/>
+    <w:p>
+      <w:pPr>
+        <w:rPr>
+          <w:rFonts w:ascii="Times New Roman" w:hAnsi="Times New Roman" w:cs="Times New Roman"/>
+          <w:sz w:val="24"/>
+          <w:szCs w:val="24"/>
+        </w:rPr>
+      </w:pPr>
+      <w:r>
+        <w:rPr>
+          <w:rFonts w:ascii="Times New Roman" w:hAnsi="Times New Roman" w:cs="Times New Roman"/>
+          <w:sz w:val="24"/>
+          <w:szCs w:val="24"/>
+        </w:rPr>
+        <w:t>As part of my learning journey, I will progressively document my work and learning activities using GitHub, where I intend to organize test artifacts, practice projects, and reflections on quality assurance concepts. This repository represents the beginning of my hands-on experience with version control and collaborative workflows. It reflects my commitment to continuous learning, practical skill development, and readiness to apply QA principles in real-world environments as I grow into a Quality Assurance professional.</w:t>
+      </w:r>
+    </w:p>
     <w:sectPr>
       <w:pgSz w:w="12240" w:h="15840"/>
       <w:pgMar w:top="1440" w:right="1440" w:bottom="1440" w:left="1440" w:header="720" w:footer="720" w:gutter="0"/>

</xml_diff>